<commit_message>
Update: KaWeHa Vorlage – Platzhalter konform mit LBBW/GSW, Querformat letzte Seite
</commit_message>
<xml_diff>
--- a/AMBA_Betreibervertrag_KaWeHa_Vorlage.docx
+++ b/AMBA_Betreibervertrag_KaWeHa_Vorlage.docx
@@ -54,23 +54,7 @@
           <w:rFonts w:ascii="Barlow" w:hAnsi="Barlow" w:cs="Arial"/>
           <w:b/>
         </w:rPr>
-        <w:t xml:space="preserve">AMBA </w:t>
-      </w:r>
-      <w:proofErr w:type="spellStart"/>
-      <w:r>
-        <w:rPr>
-          <w:rFonts w:ascii="Barlow" w:hAnsi="Barlow" w:cs="Arial"/>
-          <w:b/>
-        </w:rPr>
-        <w:t>operations</w:t>
-      </w:r>
-      <w:proofErr w:type="spellEnd"/>
-      <w:r>
-        <w:rPr>
-          <w:rFonts w:ascii="Barlow" w:hAnsi="Barlow" w:cs="Arial"/>
-          <w:b/>
-        </w:rPr>
-        <w:t xml:space="preserve"> </w:t>
+        <w:t xml:space="preserve">AMBA operations </w:t>
       </w:r>
       <w:r>
         <w:rPr>
@@ -103,9 +87,8 @@
           <w:szCs w:val="21"/>
           <w:shd w:val="clear" w:color="auto" w:fill="FFFFFF"/>
         </w:rPr>
-        <w:t xml:space="preserve">Obere </w:t>
-      </w:r>
-      <w:proofErr w:type="spellStart"/>
+        <w:t>Obere Weidenstrasse 2, 81543</w:t>
+      </w:r>
       <w:r>
         <w:rPr>
           <w:rFonts w:ascii="Barlow" w:hAnsi="Barlow" w:cs="Arial"/>
@@ -114,27 +97,6 @@
           <w:szCs w:val="21"/>
           <w:shd w:val="clear" w:color="auto" w:fill="FFFFFF"/>
         </w:rPr>
-        <w:t>Weidenstrasse</w:t>
-      </w:r>
-      <w:proofErr w:type="spellEnd"/>
-      <w:r>
-        <w:rPr>
-          <w:rFonts w:ascii="Barlow" w:hAnsi="Barlow" w:cs="Arial"/>
-          <w:color w:val="202124"/>
-          <w:sz w:val="21"/>
-          <w:szCs w:val="21"/>
-          <w:shd w:val="clear" w:color="auto" w:fill="FFFFFF"/>
-        </w:rPr>
-        <w:t xml:space="preserve"> 2, 81543</w:t>
-      </w:r>
-      <w:r>
-        <w:rPr>
-          <w:rFonts w:ascii="Barlow" w:hAnsi="Barlow" w:cs="Arial"/>
-          <w:color w:val="202124"/>
-          <w:sz w:val="21"/>
-          <w:szCs w:val="21"/>
-          <w:shd w:val="clear" w:color="auto" w:fill="FFFFFF"/>
-        </w:rPr>
         <w:t xml:space="preserve"> </w:t>
       </w:r>
       <w:r>
@@ -195,17 +157,8 @@
           <w:rFonts w:ascii="Barlow" w:hAnsi="Barlow" w:cs="Arial"/>
           <w:b/>
         </w:rPr>
-        <w:t xml:space="preserve">AMBA </w:t>
-      </w:r>
-      <w:proofErr w:type="spellStart"/>
-      <w:r>
-        <w:rPr>
-          <w:rFonts w:ascii="Barlow" w:hAnsi="Barlow" w:cs="Arial"/>
-          <w:b/>
-        </w:rPr>
-        <w:t>operations</w:t>
-      </w:r>
-      <w:proofErr w:type="spellEnd"/>
+        <w:t>AMBA operations</w:t>
+      </w:r>
       <w:r>
         <w:rPr>
           <w:rFonts w:ascii="Barlow" w:hAnsi="Barlow" w:cs="Arial"/>
@@ -267,19 +220,43 @@
         <w:rPr>
           <w:rFonts w:ascii="Barlow" w:hAnsi="Barlow" w:cs="Arial"/>
         </w:rPr>
-        <w:t>FIRMA</w:t>
+        <w:t>KUNDE_NAME</w:t>
       </w:r>
       <w:r>
         <w:rPr>
           <w:rFonts w:ascii="Barlow" w:hAnsi="Barlow" w:cs="Arial"/>
         </w:rPr>
-        <w:t>}}, {{STRASSE}}, {{PLZSTADT}}</w:t>
+        <w:t>}}, {{</w:t>
       </w:r>
       <w:r>
         <w:rPr>
           <w:rFonts w:ascii="Barlow" w:hAnsi="Barlow" w:cs="Arial"/>
         </w:rPr>
-        <w:t xml:space="preserve">, nachfolgend </w:t>
+        <w:t>KUNDE_ADRESSE</w:t>
+      </w:r>
+      <w:r>
+        <w:rPr>
+          <w:rFonts w:ascii="Barlow" w:hAnsi="Barlow" w:cs="Arial"/>
+        </w:rPr>
+        <w:t>}}</w:t>
+      </w:r>
+      <w:r>
+        <w:rPr>
+          <w:rFonts w:ascii="Barlow" w:hAnsi="Barlow" w:cs="Arial"/>
+        </w:rPr>
+        <w:t xml:space="preserve">, </w:t>
+      </w:r>
+      <w:r>
+        <w:rPr>
+          <w:rFonts w:ascii="Barlow" w:hAnsi="Barlow" w:cs="Arial"/>
+        </w:rPr>
+        <w:t xml:space="preserve">Stellplatznummer {{STELLPLATZ}} </w:t>
+      </w:r>
+      <w:r>
+        <w:rPr>
+          <w:rFonts w:ascii="Barlow" w:hAnsi="Barlow" w:cs="Arial"/>
+        </w:rPr>
+        <w:t xml:space="preserve">nachfolgend </w:t>
       </w:r>
       <w:r>
         <w:rPr>
@@ -314,21 +291,7 @@
         <w:rPr>
           <w:rFonts w:ascii="Barlow" w:hAnsi="Barlow" w:cs="Arial"/>
         </w:rPr>
-        <w:t xml:space="preserve">AMBA </w:t>
-      </w:r>
-      <w:proofErr w:type="spellStart"/>
-      <w:r>
-        <w:rPr>
-          <w:rFonts w:ascii="Barlow" w:hAnsi="Barlow" w:cs="Arial"/>
-        </w:rPr>
-        <w:t>operations</w:t>
-      </w:r>
-      <w:proofErr w:type="spellEnd"/>
-      <w:r>
-        <w:rPr>
-          <w:rFonts w:ascii="Barlow" w:hAnsi="Barlow" w:cs="Arial"/>
-        </w:rPr>
-        <w:t xml:space="preserve"> </w:t>
+        <w:t xml:space="preserve">AMBA operations </w:t>
       </w:r>
       <w:r>
         <w:rPr>
@@ -2025,23 +1988,7 @@
           <w:rFonts w:ascii="Barlow" w:hAnsi="Barlow"/>
           <w:lang w:val="de-DE"/>
         </w:rPr>
-        <w:t xml:space="preserve">AMBA </w:t>
-      </w:r>
-      <w:proofErr w:type="spellStart"/>
-      <w:r>
-        <w:rPr>
-          <w:rFonts w:ascii="Barlow" w:hAnsi="Barlow"/>
-          <w:lang w:val="de-DE"/>
-        </w:rPr>
-        <w:t>operations</w:t>
-      </w:r>
-      <w:proofErr w:type="spellEnd"/>
-      <w:r>
-        <w:rPr>
-          <w:rFonts w:ascii="Barlow" w:hAnsi="Barlow"/>
-          <w:lang w:val="de-DE"/>
-        </w:rPr>
-        <w:t xml:space="preserve"> </w:t>
+        <w:t xml:space="preserve">AMBA operations </w:t>
       </w:r>
       <w:r>
         <w:rPr>
@@ -2321,21 +2268,7 @@
         <w:rPr>
           <w:rFonts w:ascii="Barlow" w:hAnsi="Barlow"/>
         </w:rPr>
-        <w:t xml:space="preserve">Der Betreiber ist verantwortlich für den Betrieb der Ladestationen. Der Betreiber bindet die Ladestationen zur Abrechnung der Ladevorgänge sowie ggf. zur Durchführung von Lade- bzw. Lastmanagement und Fernüberwachung an das Back-End der Firma </w:t>
-      </w:r>
-      <w:proofErr w:type="spellStart"/>
-      <w:r>
-        <w:rPr>
-          <w:rFonts w:ascii="Barlow" w:hAnsi="Barlow"/>
-        </w:rPr>
-        <w:t>reev</w:t>
-      </w:r>
-      <w:proofErr w:type="spellEnd"/>
-      <w:r>
-        <w:rPr>
-          <w:rFonts w:ascii="Barlow" w:hAnsi="Barlow"/>
-        </w:rPr>
-        <w:t xml:space="preserve"> GmbH an.</w:t>
+        <w:t>Der Betreiber ist verantwortlich für den Betrieb der Ladestationen. Der Betreiber bindet die Ladestationen zur Abrechnung der Ladevorgänge sowie ggf. zur Durchführung von Lade- bzw. Lastmanagement und Fernüberwachung an das Back-End der Firma reev GmbH an.</w:t>
       </w:r>
     </w:p>
     <w:p>
@@ -3298,21 +3231,7 @@
         <w:rPr>
           <w:rFonts w:ascii="Barlow" w:hAnsi="Barlow"/>
         </w:rPr>
-        <w:t xml:space="preserve">Dies umfasst auch die Reinigung der Ladestationen, den Remote Support und die Möglichkeit einer </w:t>
-      </w:r>
-      <w:proofErr w:type="gramStart"/>
-      <w:r>
-        <w:rPr>
-          <w:rFonts w:ascii="Barlow" w:hAnsi="Barlow"/>
-        </w:rPr>
-        <w:t>Online Fehlerbehebung</w:t>
-      </w:r>
-      <w:proofErr w:type="gramEnd"/>
-      <w:r>
-        <w:rPr>
-          <w:rFonts w:ascii="Barlow" w:hAnsi="Barlow"/>
-        </w:rPr>
-        <w:t xml:space="preserve"> von Störungen sowie erforderlichenfalls die Installation von Firmware Updates für den Betrieb der Ladestationen, soweit sie vom jeweiligen Hersteller der Ladestation zur Verfügung gestellt werden.</w:t>
+        <w:t>Dies umfasst auch die Reinigung der Ladestationen, den Remote Support und die Möglichkeit einer Online Fehlerbehebung von Störungen sowie erforderlichenfalls die Installation von Firmware Updates für den Betrieb der Ladestationen, soweit sie vom jeweiligen Hersteller der Ladestation zur Verfügung gestellt werden.</w:t>
       </w:r>
     </w:p>
     <w:p>
@@ -3342,21 +3261,7 @@
         <w:rPr>
           <w:rFonts w:ascii="Barlow" w:hAnsi="Barlow"/>
         </w:rPr>
-        <w:t xml:space="preserve">Im Rahmen des Störungsmanagements ergreift der Betreiber alle notwendigen Maßnahmen, um Störungen und Schäden an den Ladestationen kurzfristig zu beheben. Eine Störung liegt vor, wenn die Ladestation nicht mehr in vollem Umfang den vertraglichen Vorgaben entsprechend genutzt werden kann. Der Kunde informiert den Betreiber unverzüglich über ihm bekannte Störungen und Schäden. Ein Schaden liegt vor bei jeder Beschädigung einer Ladestation unabhängig davon, ob sie die Funktionstüchtigkeit einer Ladestation beeinträchtigt. Die Anbindung der Ladestationen an das Back-End gewährleistet einen Remote Support und die Möglichkeit einer </w:t>
-      </w:r>
-      <w:proofErr w:type="gramStart"/>
-      <w:r>
-        <w:rPr>
-          <w:rFonts w:ascii="Barlow" w:hAnsi="Barlow"/>
-        </w:rPr>
-        <w:t>Online Fehlerbehebung</w:t>
-      </w:r>
-      <w:proofErr w:type="gramEnd"/>
-      <w:r>
-        <w:rPr>
-          <w:rFonts w:ascii="Barlow" w:hAnsi="Barlow"/>
-        </w:rPr>
-        <w:t xml:space="preserve"> von Störungen. Sollte eine Störung im Rahmen dieses Remote Supports nicht behoben werden können, koordiniert der Betreiber einen Vorort-Entstörungsdienst im Zeitraum von Montag bis Freitag 08:00 bis 20:00 Uhr gegen zusätzliches Entgelt, wenn diese Störungen nicht durch den </w:t>
+        <w:t xml:space="preserve">Im Rahmen des Störungsmanagements ergreift der Betreiber alle notwendigen Maßnahmen, um Störungen und Schäden an den Ladestationen kurzfristig zu beheben. Eine Störung liegt vor, wenn die Ladestation nicht mehr in vollem Umfang den vertraglichen Vorgaben entsprechend genutzt werden kann. Der Kunde informiert den Betreiber unverzüglich über ihm bekannte Störungen und Schäden. Ein Schaden liegt vor bei jeder Beschädigung einer Ladestation unabhängig davon, ob sie die Funktionstüchtigkeit einer Ladestation beeinträchtigt. Die Anbindung der Ladestationen an das Back-End gewährleistet einen Remote Support und die Möglichkeit einer Online Fehlerbehebung von Störungen. Sollte eine Störung im Rahmen dieses Remote Supports nicht behoben werden können, koordiniert der Betreiber einen Vorort-Entstörungsdienst im Zeitraum von Montag bis Freitag 08:00 bis 20:00 Uhr gegen zusätzliches Entgelt, wenn diese Störungen nicht durch den </w:t>
       </w:r>
       <w:r>
         <w:rPr>
@@ -3615,49 +3520,7 @@
         <w:rPr>
           <w:rFonts w:ascii="Barlow" w:hAnsi="Barlow"/>
         </w:rPr>
-        <w:t xml:space="preserve">Die Nutzung von Ladestationen durch berechtigte User setzt die vorherige erfolgreiche Registrierung des jeweiligen berechtigten Users auf der Mobiltelefon-App </w:t>
-      </w:r>
-      <w:proofErr w:type="gramStart"/>
-      <w:r>
-        <w:rPr>
-          <w:rFonts w:ascii="Barlow" w:hAnsi="Barlow"/>
-        </w:rPr>
-        <w:t>des gewählten Back</w:t>
-      </w:r>
-      <w:proofErr w:type="gramEnd"/>
-      <w:r>
-        <w:rPr>
-          <w:rFonts w:ascii="Barlow" w:hAnsi="Barlow"/>
-        </w:rPr>
-        <w:t xml:space="preserve"> – </w:t>
-      </w:r>
-      <w:proofErr w:type="gramStart"/>
-      <w:r>
-        <w:rPr>
-          <w:rFonts w:ascii="Barlow" w:hAnsi="Barlow"/>
-        </w:rPr>
-        <w:t>Ends  voraus</w:t>
-      </w:r>
-      <w:proofErr w:type="gramEnd"/>
-      <w:r>
-        <w:rPr>
-          <w:rFonts w:ascii="Barlow" w:hAnsi="Barlow"/>
-        </w:rPr>
-        <w:t xml:space="preserve">. Neben der Angabe seiner persönlichen Daten oder Firmendaten und dem Nachweis der Berechtigung mittels vom Betreiber über den Kunden zur Verfügung gestellter Registrierungszugangsdaten muss der berechtigte User hierbei insbesondere sein Zahlungsmittel hinterlegen und die </w:t>
-      </w:r>
-      <w:proofErr w:type="gramStart"/>
-      <w:r>
-        <w:rPr>
-          <w:rFonts w:ascii="Barlow" w:hAnsi="Barlow"/>
-        </w:rPr>
-        <w:t>CPO Nutzungsbedingungen</w:t>
-      </w:r>
-      <w:proofErr w:type="gramEnd"/>
-      <w:r>
-        <w:rPr>
-          <w:rFonts w:ascii="Barlow" w:hAnsi="Barlow"/>
-        </w:rPr>
-        <w:t xml:space="preserve"> für die Zurverfügungstellung von elektrischer Energie und die Nutzung von Ladestationen geregelten Bedingungen des Betreibers akzeptieren. Dies gilt auch insoweit als der Kunde die Ladestationen selbst als berechtigter User nutzt.</w:t>
+        <w:t>Die Nutzung von Ladestationen durch berechtigte User setzt die vorherige erfolgreiche Registrierung des jeweiligen berechtigten Users auf der Mobiltelefon-App des gewählten Back – Ends  voraus. Neben der Angabe seiner persönlichen Daten oder Firmendaten und dem Nachweis der Berechtigung mittels vom Betreiber über den Kunden zur Verfügung gestellter Registrierungszugangsdaten muss der berechtigte User hierbei insbesondere sein Zahlungsmittel hinterlegen und die CPO Nutzungsbedingungen für die Zurverfügungstellung von elektrischer Energie und die Nutzung von Ladestationen geregelten Bedingungen des Betreibers akzeptieren. Dies gilt auch insoweit als der Kunde die Ladestationen selbst als berechtigter User nutzt.</w:t>
       </w:r>
       <w:bookmarkEnd w:id="32"/>
     </w:p>
@@ -4129,7 +3992,19 @@
         <w:rPr>
           <w:rFonts w:ascii="Barlow" w:hAnsi="Barlow"/>
         </w:rPr>
-        <w:t>{{LAUFZEIT}}</w:t>
+        <w:t>{{LAUFZEIT</w:t>
+      </w:r>
+      <w:r>
+        <w:rPr>
+          <w:rFonts w:ascii="Barlow" w:hAnsi="Barlow"/>
+        </w:rPr>
+        <w:t>_JAHRE</w:t>
+      </w:r>
+      <w:r>
+        <w:rPr>
+          <w:rFonts w:ascii="Barlow" w:hAnsi="Barlow"/>
+        </w:rPr>
+        <w:t>}}</w:t>
       </w:r>
       <w:r>
         <w:rPr>
@@ -4168,13 +4043,25 @@
         <w:rPr>
           <w:rFonts w:ascii="Barlow" w:hAnsi="Barlow"/>
         </w:rPr>
-        <w:t>{{LAUFZEIT}}</w:t>
-      </w:r>
-      <w:r>
-        <w:rPr>
-          <w:rFonts w:ascii="Barlow" w:hAnsi="Barlow"/>
-        </w:rPr>
-        <w:t xml:space="preserve"> Jahren, danach zum Ablauf eines jeden Vertragsjahres – durch Erklärung in Textform (z.B. per E-Mail) mit einer Frist von drei (3) Monaten ordentlich gekündigt werden. </w:t>
+        <w:t>{{LAUFZEIT</w:t>
+      </w:r>
+      <w:r>
+        <w:rPr>
+          <w:rFonts w:ascii="Barlow" w:hAnsi="Barlow"/>
+        </w:rPr>
+        <w:t>_JAHRE}}</w:t>
+      </w:r>
+      <w:r>
+        <w:rPr>
+          <w:rFonts w:ascii="Barlow" w:hAnsi="Barlow"/>
+        </w:rPr>
+        <w:t xml:space="preserve"> </w:t>
+      </w:r>
+      <w:r>
+        <w:rPr>
+          <w:rFonts w:ascii="Barlow" w:hAnsi="Barlow"/>
+        </w:rPr>
+        <w:t xml:space="preserve">Jahren, danach zum Ablauf eines jeden Vertragsjahres – durch Erklärung in Textform (z.B. per E-Mail) mit einer Frist von drei (3) Monaten ordentlich gekündigt werden. </w:t>
       </w:r>
     </w:p>
     <w:p>
@@ -4357,21 +4244,7 @@
         <w:rPr>
           <w:rFonts w:ascii="Barlow" w:hAnsi="Barlow"/>
         </w:rPr>
-        <w:t xml:space="preserve">den </w:t>
-      </w:r>
-      <w:proofErr w:type="gramStart"/>
-      <w:r>
-        <w:rPr>
-          <w:rFonts w:ascii="Barlow" w:hAnsi="Barlow"/>
-        </w:rPr>
-        <w:t>Stellplatz</w:t>
-      </w:r>
-      <w:proofErr w:type="gramEnd"/>
-      <w:r>
-        <w:rPr>
-          <w:rFonts w:ascii="Barlow" w:hAnsi="Barlow"/>
-        </w:rPr>
-        <w:t xml:space="preserve"> auf dem eine Ladeinfrastruktur aufgebaut ist, verkaufen oder nicht mehr mieten. </w:t>
+        <w:t xml:space="preserve">den Stellplatz auf dem eine Ladeinfrastruktur aufgebaut ist, verkaufen oder nicht mehr mieten. </w:t>
       </w:r>
     </w:p>
     <w:p>
@@ -4861,43 +4734,7 @@
           <w:sz w:val="12"/>
           <w:szCs w:val="12"/>
         </w:rPr>
-        <w:t>Betreiber (</w:t>
-      </w:r>
-      <w:proofErr w:type="spellStart"/>
-      <w:r>
-        <w:rPr>
-          <w:rFonts w:cstheme="majorHAnsi"/>
-          <w:sz w:val="12"/>
-          <w:szCs w:val="12"/>
-        </w:rPr>
-        <w:t>amba</w:t>
-      </w:r>
-      <w:proofErr w:type="spellEnd"/>
-      <w:r>
-        <w:rPr>
-          <w:rFonts w:cstheme="majorHAnsi"/>
-          <w:sz w:val="12"/>
-          <w:szCs w:val="12"/>
-        </w:rPr>
-        <w:t xml:space="preserve"> </w:t>
-      </w:r>
-      <w:proofErr w:type="spellStart"/>
-      <w:r>
-        <w:rPr>
-          <w:rFonts w:cstheme="majorHAnsi"/>
-          <w:sz w:val="12"/>
-          <w:szCs w:val="12"/>
-        </w:rPr>
-        <w:t>operations</w:t>
-      </w:r>
-      <w:proofErr w:type="spellEnd"/>
-      <w:r>
-        <w:rPr>
-          <w:rFonts w:cstheme="majorHAnsi"/>
-          <w:sz w:val="12"/>
-          <w:szCs w:val="12"/>
-        </w:rPr>
-        <w:t xml:space="preserve"> GmbH)</w:t>
+        <w:t>Betreiber (amba operations GmbH)</w:t>
       </w:r>
       <w:r>
         <w:rPr>
@@ -5072,12 +4909,12 @@
         <w:tblLook w:val="04A0" w:firstRow="1" w:lastRow="0" w:firstColumn="1" w:lastColumn="0" w:noHBand="0" w:noVBand="1"/>
       </w:tblPr>
       <w:tblGrid>
-        <w:gridCol w:w="4111"/>
-        <w:gridCol w:w="2268"/>
-        <w:gridCol w:w="1560"/>
-        <w:gridCol w:w="1701"/>
-        <w:gridCol w:w="2126"/>
-        <w:gridCol w:w="2551"/>
+        <w:gridCol w:w="4056"/>
+        <w:gridCol w:w="2266"/>
+        <w:gridCol w:w="1657"/>
+        <w:gridCol w:w="1687"/>
+        <w:gridCol w:w="2108"/>
+        <w:gridCol w:w="2543"/>
       </w:tblGrid>
       <w:tr>
         <w:trPr>
@@ -5236,7 +5073,6 @@
                 <w:szCs w:val="20"/>
               </w:rPr>
             </w:pPr>
-            <w:proofErr w:type="spellStart"/>
             <w:r>
               <w:rPr>
                 <w:rFonts w:ascii="Barlow" w:hAnsi="Barlow"/>
@@ -5245,7 +5081,6 @@
               </w:rPr>
               <w:t>Inbetriebnahmedatum</w:t>
             </w:r>
-            <w:proofErr w:type="spellEnd"/>
           </w:p>
         </w:tc>
       </w:tr>
@@ -5287,7 +5122,7 @@
                 <w:rFonts w:ascii="Arial" w:hAnsi="Arial" w:cs="Arial"/>
                 <w:sz w:val="18"/>
               </w:rPr>
-              <w:t>_1}}</w:t>
+              <w:t>}}</w:t>
             </w:r>
           </w:p>
         </w:tc>
@@ -5311,7 +5146,21 @@
                 <w:rFonts w:ascii="Arial" w:hAnsi="Arial" w:cs="Arial"/>
                 <w:sz w:val="18"/>
               </w:rPr>
-              <w:t>{{ART_1}}</w:t>
+              <w:t>{{</w:t>
+            </w:r>
+            <w:r>
+              <w:rPr>
+                <w:rFonts w:ascii="Arial" w:hAnsi="Arial" w:cs="Arial"/>
+                <w:sz w:val="18"/>
+              </w:rPr>
+              <w:t>LADEEINRICHTUNG</w:t>
+            </w:r>
+            <w:r>
+              <w:rPr>
+                <w:rFonts w:ascii="Arial" w:hAnsi="Arial" w:cs="Arial"/>
+                <w:sz w:val="18"/>
+              </w:rPr>
+              <w:t>}}</w:t>
             </w:r>
           </w:p>
         </w:tc>
@@ -5335,7 +5184,14 @@
                 <w:rFonts w:ascii="Arial" w:hAnsi="Arial" w:cs="Arial"/>
                 <w:sz w:val="18"/>
               </w:rPr>
-              <w:t>{{ANZAHL_1}}</w:t>
+              <w:t>{</w:t>
+            </w:r>
+            <w:r>
+              <w:rPr>
+                <w:rFonts w:ascii="Arial" w:hAnsi="Arial" w:cs="Arial"/>
+                <w:sz w:val="18"/>
+              </w:rPr>
+              <w:t>{LADEPUNKTE}}</w:t>
             </w:r>
           </w:p>
         </w:tc>
@@ -5668,25 +5524,7 @@
               <w:sz w:val="14"/>
               <w:szCs w:val="14"/>
             </w:rPr>
-            <w:t xml:space="preserve">AMBA </w:t>
-          </w:r>
-          <w:proofErr w:type="spellStart"/>
-          <w:r>
-            <w:rPr>
-              <w:rFonts w:ascii="Barlow" w:hAnsi="Barlow"/>
-              <w:sz w:val="14"/>
-              <w:szCs w:val="14"/>
-            </w:rPr>
-            <w:t>operations</w:t>
-          </w:r>
-          <w:proofErr w:type="spellEnd"/>
-          <w:r>
-            <w:rPr>
-              <w:rFonts w:ascii="Barlow" w:hAnsi="Barlow"/>
-              <w:sz w:val="14"/>
-              <w:szCs w:val="14"/>
-            </w:rPr>
-            <w:t xml:space="preserve"> </w:t>
+            <w:t xml:space="preserve">AMBA operations </w:t>
           </w:r>
           <w:r>
             <w:rPr>
@@ -5874,25 +5712,7 @@
               <w:sz w:val="14"/>
               <w:szCs w:val="14"/>
             </w:rPr>
-            <w:t xml:space="preserve">Ust – </w:t>
-          </w:r>
-          <w:proofErr w:type="spellStart"/>
-          <w:r>
-            <w:rPr>
-              <w:rFonts w:ascii="Barlow" w:hAnsi="Barlow"/>
-              <w:sz w:val="14"/>
-              <w:szCs w:val="14"/>
-            </w:rPr>
-            <w:t>IdNr</w:t>
-          </w:r>
-          <w:proofErr w:type="spellEnd"/>
-          <w:r>
-            <w:rPr>
-              <w:rFonts w:ascii="Barlow" w:hAnsi="Barlow"/>
-              <w:sz w:val="14"/>
-              <w:szCs w:val="14"/>
-            </w:rPr>
-            <w:t>. DE323 85 85 22</w:t>
+            <w:t>Ust – IdNr. DE323 85 85 22</w:t>
           </w:r>
         </w:p>
       </w:tc>
@@ -8466,6 +8286,17 @@
 </file>
 
 <file path=customXml/item1.xml><?xml version="1.0" encoding="utf-8"?>
+<p:properties xmlns:p="http://schemas.microsoft.com/office/2006/metadata/properties" xmlns:xsi="http://www.w3.org/2001/XMLSchema-instance" xmlns:pc="http://schemas.microsoft.com/office/infopath/2007/PartnerControls">
+  <documentManagement>
+    <lcf76f155ced4ddcb4097134ff3c332f xmlns="8a383c2e-bd54-4902-a119-5b87932b8e96">
+      <Terms xmlns="http://schemas.microsoft.com/office/infopath/2007/PartnerControls"/>
+    </lcf76f155ced4ddcb4097134ff3c332f>
+    <TaxCatchAll xmlns="bb47c008-c9da-4c4d-aa48-f28061b9cf67" xsi:nil="true"/>
+  </documentManagement>
+</p:properties>
+</file>
+
+<file path=customXml/item2.xml><?xml version="1.0" encoding="utf-8"?>
 <ct:contentTypeSchema xmlns:ct="http://schemas.microsoft.com/office/2006/metadata/contentType" xmlns:ma="http://schemas.microsoft.com/office/2006/metadata/properties/metaAttributes" ct:_="" ma:_="" ma:contentTypeName="Dokument" ma:contentTypeID="0x010100F51D2DA3021EF44F8FAF5E03764C10C1" ma:contentTypeVersion="18" ma:contentTypeDescription="Ein neues Dokument erstellen." ma:contentTypeScope="" ma:versionID="4c658a578920193a9ada3d1a2924bef9">
   <xsd:schema xmlns:xsd="http://www.w3.org/2001/XMLSchema" xmlns:xs="http://www.w3.org/2001/XMLSchema" xmlns:p="http://schemas.microsoft.com/office/2006/metadata/properties" xmlns:ns2="8a383c2e-bd54-4902-a119-5b87932b8e96" xmlns:ns3="bb47c008-c9da-4c4d-aa48-f28061b9cf67" targetNamespace="http://schemas.microsoft.com/office/2006/metadata/properties" ma:root="true" ma:fieldsID="51fbc5999d14e7bbe1a329ace4bdbfbd" ns2:_="" ns3:_="">
     <xsd:import namespace="8a383c2e-bd54-4902-a119-5b87932b8e96"/>
@@ -8720,17 +8551,6 @@
 </ct:contentTypeSchema>
 </file>
 
-<file path=customXml/item2.xml><?xml version="1.0" encoding="utf-8"?>
-<p:properties xmlns:p="http://schemas.microsoft.com/office/2006/metadata/properties" xmlns:xsi="http://www.w3.org/2001/XMLSchema-instance" xmlns:pc="http://schemas.microsoft.com/office/infopath/2007/PartnerControls">
-  <documentManagement>
-    <lcf76f155ced4ddcb4097134ff3c332f xmlns="8a383c2e-bd54-4902-a119-5b87932b8e96">
-      <Terms xmlns="http://schemas.microsoft.com/office/infopath/2007/PartnerControls"/>
-    </lcf76f155ced4ddcb4097134ff3c332f>
-    <TaxCatchAll xmlns="bb47c008-c9da-4c4d-aa48-f28061b9cf67" xsi:nil="true"/>
-  </documentManagement>
-</p:properties>
-</file>
-
 <file path=customXml/item3.xml><?xml version="1.0" encoding="utf-8"?>
 <?mso-contentType ?>
 <FormTemplates xmlns="http://schemas.microsoft.com/sharepoint/v3/contenttype/forms">
@@ -8741,6 +8561,17 @@
 </file>
 
 <file path=customXml/itemProps1.xml><?xml version="1.0" encoding="utf-8"?>
+<ds:datastoreItem xmlns:ds="http://schemas.openxmlformats.org/officeDocument/2006/customXml" ds:itemID="{F3050DF5-BD41-4CBE-90C1-8D28B9CFA94C}">
+  <ds:schemaRefs>
+    <ds:schemaRef ds:uri="http://schemas.microsoft.com/office/2006/metadata/properties"/>
+    <ds:schemaRef ds:uri="http://schemas.microsoft.com/office/infopath/2007/PartnerControls"/>
+    <ds:schemaRef ds:uri="8a383c2e-bd54-4902-a119-5b87932b8e96"/>
+    <ds:schemaRef ds:uri="bb47c008-c9da-4c4d-aa48-f28061b9cf67"/>
+  </ds:schemaRefs>
+</ds:datastoreItem>
+</file>
+
+<file path=customXml/itemProps2.xml><?xml version="1.0" encoding="utf-8"?>
 <ds:datastoreItem xmlns:ds="http://schemas.openxmlformats.org/officeDocument/2006/customXml" ds:itemID="{42A4AA67-1B28-4B10-B002-3B6601EF79A5}">
   <ds:schemaRefs>
     <ds:schemaRef ds:uri="http://schemas.microsoft.com/office/2006/metadata/contentType"/>
@@ -8759,17 +8590,6 @@
 </ds:datastoreItem>
 </file>
 
-<file path=customXml/itemProps2.xml><?xml version="1.0" encoding="utf-8"?>
-<ds:datastoreItem xmlns:ds="http://schemas.openxmlformats.org/officeDocument/2006/customXml" ds:itemID="{F3050DF5-BD41-4CBE-90C1-8D28B9CFA94C}">
-  <ds:schemaRefs>
-    <ds:schemaRef ds:uri="http://schemas.microsoft.com/office/2006/metadata/properties"/>
-    <ds:schemaRef ds:uri="http://schemas.microsoft.com/office/infopath/2007/PartnerControls"/>
-    <ds:schemaRef ds:uri="8a383c2e-bd54-4902-a119-5b87932b8e96"/>
-    <ds:schemaRef ds:uri="bb47c008-c9da-4c4d-aa48-f28061b9cf67"/>
-  </ds:schemaRefs>
-</ds:datastoreItem>
-</file>
-
 <file path=customXml/itemProps3.xml><?xml version="1.0" encoding="utf-8"?>
 <ds:datastoreItem xmlns:ds="http://schemas.openxmlformats.org/officeDocument/2006/customXml" ds:itemID="{E31CCCC5-5A07-4BA8-AF4B-0E8119209082}">
   <ds:schemaRefs>

</xml_diff>

<commit_message>
KaWeHa: neues Vertragsmodell mit Wallboxeigentum, einheitlicher Platzhalter-Standard (kein Angebot/Datum/AP)
</commit_message>
<xml_diff>
--- a/AMBA_Betreibervertrag_KaWeHa_Vorlage.docx
+++ b/AMBA_Betreibervertrag_KaWeHa_Vorlage.docx
@@ -214,37 +214,43 @@
         <w:rPr>
           <w:rFonts w:ascii="Barlow" w:hAnsi="Barlow" w:cs="Arial"/>
         </w:rPr>
-        <w:t>{{</w:t>
+        <w:t xml:space="preserve"> </w:t>
       </w:r>
       <w:r>
         <w:rPr>
           <w:rFonts w:ascii="Barlow" w:hAnsi="Barlow" w:cs="Arial"/>
         </w:rPr>
-        <w:t>KUNDE_NAME</w:t>
+        <w:t>{{FIRMA}}</w:t>
       </w:r>
       <w:r>
         <w:rPr>
           <w:rFonts w:ascii="Barlow" w:hAnsi="Barlow" w:cs="Arial"/>
         </w:rPr>
-        <w:t>}}, {{</w:t>
+        <w:t xml:space="preserve">, </w:t>
       </w:r>
       <w:r>
         <w:rPr>
           <w:rFonts w:ascii="Barlow" w:hAnsi="Barlow" w:cs="Arial"/>
         </w:rPr>
-        <w:t>KUNDE_ADRESSE</w:t>
+        <w:t>{{STRASSE}}</w:t>
       </w:r>
       <w:r>
         <w:rPr>
           <w:rFonts w:ascii="Barlow" w:hAnsi="Barlow" w:cs="Arial"/>
         </w:rPr>
-        <w:t>}}</w:t>
+        <w:t xml:space="preserve">, </w:t>
       </w:r>
       <w:r>
         <w:rPr>
           <w:rFonts w:ascii="Barlow" w:hAnsi="Barlow" w:cs="Arial"/>
         </w:rPr>
-        <w:t xml:space="preserve">, </w:t>
+        <w:t>{{PLZSTADT}}</w:t>
+      </w:r>
+      <w:r>
+        <w:rPr>
+          <w:rFonts w:ascii="Barlow" w:hAnsi="Barlow" w:cs="Arial"/>
+        </w:rPr>
+        <w:t xml:space="preserve"> </w:t>
       </w:r>
       <w:r>
         <w:rPr>
@@ -3992,25 +3998,13 @@
         <w:rPr>
           <w:rFonts w:ascii="Barlow" w:hAnsi="Barlow"/>
         </w:rPr>
-        <w:t>{{LAUFZEIT</w:t>
-      </w:r>
-      <w:r>
-        <w:rPr>
-          <w:rFonts w:ascii="Barlow" w:hAnsi="Barlow"/>
-        </w:rPr>
-        <w:t>_JAHRE</w:t>
-      </w:r>
-      <w:r>
-        <w:rPr>
-          <w:rFonts w:ascii="Barlow" w:hAnsi="Barlow"/>
-        </w:rPr>
-        <w:t>}}</w:t>
-      </w:r>
-      <w:r>
-        <w:rPr>
-          <w:rFonts w:ascii="Barlow" w:hAnsi="Barlow"/>
-        </w:rPr>
-        <w:t xml:space="preserve"> Vertragsjahre ab Betriebsübernahme</w:t>
+        <w:t xml:space="preserve">{{LAUFZEIT}} </w:t>
+      </w:r>
+      <w:r>
+        <w:rPr>
+          <w:rFonts w:ascii="Barlow" w:hAnsi="Barlow"/>
+        </w:rPr>
+        <w:t>Vertragsjahre ab Betriebsübernahme</w:t>
       </w:r>
       <w:r>
         <w:rPr>
@@ -4043,19 +4037,7 @@
         <w:rPr>
           <w:rFonts w:ascii="Barlow" w:hAnsi="Barlow"/>
         </w:rPr>
-        <w:t>{{LAUFZEIT</w:t>
-      </w:r>
-      <w:r>
-        <w:rPr>
-          <w:rFonts w:ascii="Barlow" w:hAnsi="Barlow"/>
-        </w:rPr>
-        <w:t>_JAHRE}}</w:t>
-      </w:r>
-      <w:r>
-        <w:rPr>
-          <w:rFonts w:ascii="Barlow" w:hAnsi="Barlow"/>
-        </w:rPr>
-        <w:t xml:space="preserve"> </w:t>
+        <w:t xml:space="preserve">{{LAUFZEIT}} </w:t>
       </w:r>
       <w:r>
         <w:rPr>
@@ -5108,21 +5090,7 @@
                 <w:rFonts w:ascii="Arial" w:hAnsi="Arial" w:cs="Arial"/>
                 <w:sz w:val="18"/>
               </w:rPr>
-              <w:t>{{</w:t>
-            </w:r>
-            <w:r>
-              <w:rPr>
-                <w:rFonts w:ascii="Arial" w:hAnsi="Arial" w:cs="Arial"/>
-                <w:sz w:val="18"/>
-              </w:rPr>
-              <w:t>STANDORT</w:t>
-            </w:r>
-            <w:r>
-              <w:rPr>
-                <w:rFonts w:ascii="Arial" w:hAnsi="Arial" w:cs="Arial"/>
-                <w:sz w:val="18"/>
-              </w:rPr>
-              <w:t>}}</w:t>
+              <w:t>{{STANDORT}}</w:t>
             </w:r>
           </w:p>
         </w:tc>
@@ -5146,21 +5114,7 @@
                 <w:rFonts w:ascii="Arial" w:hAnsi="Arial" w:cs="Arial"/>
                 <w:sz w:val="18"/>
               </w:rPr>
-              <w:t>{{</w:t>
-            </w:r>
-            <w:r>
-              <w:rPr>
-                <w:rFonts w:ascii="Arial" w:hAnsi="Arial" w:cs="Arial"/>
-                <w:sz w:val="18"/>
-              </w:rPr>
-              <w:t>LADEEINRICHTUNG</w:t>
-            </w:r>
-            <w:r>
-              <w:rPr>
-                <w:rFonts w:ascii="Arial" w:hAnsi="Arial" w:cs="Arial"/>
-                <w:sz w:val="18"/>
-              </w:rPr>
-              <w:t>}}</w:t>
+              <w:t>{{LADEEINRICHTUNG}}</w:t>
             </w:r>
           </w:p>
         </w:tc>
@@ -5184,14 +5138,7 @@
                 <w:rFonts w:ascii="Arial" w:hAnsi="Arial" w:cs="Arial"/>
                 <w:sz w:val="18"/>
               </w:rPr>
-              <w:t>{</w:t>
-            </w:r>
-            <w:r>
-              <w:rPr>
-                <w:rFonts w:ascii="Arial" w:hAnsi="Arial" w:cs="Arial"/>
-                <w:sz w:val="18"/>
-              </w:rPr>
-              <w:t>{LADEPUNKTE}}</w:t>
+              <w:t>{{LADEPUNKTE}}</w:t>
             </w:r>
           </w:p>
         </w:tc>
@@ -8286,17 +8233,6 @@
 </file>
 
 <file path=customXml/item1.xml><?xml version="1.0" encoding="utf-8"?>
-<p:properties xmlns:p="http://schemas.microsoft.com/office/2006/metadata/properties" xmlns:xsi="http://www.w3.org/2001/XMLSchema-instance" xmlns:pc="http://schemas.microsoft.com/office/infopath/2007/PartnerControls">
-  <documentManagement>
-    <lcf76f155ced4ddcb4097134ff3c332f xmlns="8a383c2e-bd54-4902-a119-5b87932b8e96">
-      <Terms xmlns="http://schemas.microsoft.com/office/infopath/2007/PartnerControls"/>
-    </lcf76f155ced4ddcb4097134ff3c332f>
-    <TaxCatchAll xmlns="bb47c008-c9da-4c4d-aa48-f28061b9cf67" xsi:nil="true"/>
-  </documentManagement>
-</p:properties>
-</file>
-
-<file path=customXml/item2.xml><?xml version="1.0" encoding="utf-8"?>
 <ct:contentTypeSchema xmlns:ct="http://schemas.microsoft.com/office/2006/metadata/contentType" xmlns:ma="http://schemas.microsoft.com/office/2006/metadata/properties/metaAttributes" ct:_="" ma:_="" ma:contentTypeName="Dokument" ma:contentTypeID="0x010100F51D2DA3021EF44F8FAF5E03764C10C1" ma:contentTypeVersion="18" ma:contentTypeDescription="Ein neues Dokument erstellen." ma:contentTypeScope="" ma:versionID="4c658a578920193a9ada3d1a2924bef9">
   <xsd:schema xmlns:xsd="http://www.w3.org/2001/XMLSchema" xmlns:xs="http://www.w3.org/2001/XMLSchema" xmlns:p="http://schemas.microsoft.com/office/2006/metadata/properties" xmlns:ns2="8a383c2e-bd54-4902-a119-5b87932b8e96" xmlns:ns3="bb47c008-c9da-4c4d-aa48-f28061b9cf67" targetNamespace="http://schemas.microsoft.com/office/2006/metadata/properties" ma:root="true" ma:fieldsID="51fbc5999d14e7bbe1a329ace4bdbfbd" ns2:_="" ns3:_="">
     <xsd:import namespace="8a383c2e-bd54-4902-a119-5b87932b8e96"/>
@@ -8551,6 +8487,17 @@
 </ct:contentTypeSchema>
 </file>
 
+<file path=customXml/item2.xml><?xml version="1.0" encoding="utf-8"?>
+<p:properties xmlns:p="http://schemas.microsoft.com/office/2006/metadata/properties" xmlns:xsi="http://www.w3.org/2001/XMLSchema-instance" xmlns:pc="http://schemas.microsoft.com/office/infopath/2007/PartnerControls">
+  <documentManagement>
+    <lcf76f155ced4ddcb4097134ff3c332f xmlns="8a383c2e-bd54-4902-a119-5b87932b8e96">
+      <Terms xmlns="http://schemas.microsoft.com/office/infopath/2007/PartnerControls"/>
+    </lcf76f155ced4ddcb4097134ff3c332f>
+    <TaxCatchAll xmlns="bb47c008-c9da-4c4d-aa48-f28061b9cf67" xsi:nil="true"/>
+  </documentManagement>
+</p:properties>
+</file>
+
 <file path=customXml/item3.xml><?xml version="1.0" encoding="utf-8"?>
 <?mso-contentType ?>
 <FormTemplates xmlns="http://schemas.microsoft.com/sharepoint/v3/contenttype/forms">
@@ -8561,17 +8508,6 @@
 </file>
 
 <file path=customXml/itemProps1.xml><?xml version="1.0" encoding="utf-8"?>
-<ds:datastoreItem xmlns:ds="http://schemas.openxmlformats.org/officeDocument/2006/customXml" ds:itemID="{F3050DF5-BD41-4CBE-90C1-8D28B9CFA94C}">
-  <ds:schemaRefs>
-    <ds:schemaRef ds:uri="http://schemas.microsoft.com/office/2006/metadata/properties"/>
-    <ds:schemaRef ds:uri="http://schemas.microsoft.com/office/infopath/2007/PartnerControls"/>
-    <ds:schemaRef ds:uri="8a383c2e-bd54-4902-a119-5b87932b8e96"/>
-    <ds:schemaRef ds:uri="bb47c008-c9da-4c4d-aa48-f28061b9cf67"/>
-  </ds:schemaRefs>
-</ds:datastoreItem>
-</file>
-
-<file path=customXml/itemProps2.xml><?xml version="1.0" encoding="utf-8"?>
 <ds:datastoreItem xmlns:ds="http://schemas.openxmlformats.org/officeDocument/2006/customXml" ds:itemID="{42A4AA67-1B28-4B10-B002-3B6601EF79A5}">
   <ds:schemaRefs>
     <ds:schemaRef ds:uri="http://schemas.microsoft.com/office/2006/metadata/contentType"/>
@@ -8590,6 +8526,17 @@
 </ds:datastoreItem>
 </file>
 
+<file path=customXml/itemProps2.xml><?xml version="1.0" encoding="utf-8"?>
+<ds:datastoreItem xmlns:ds="http://schemas.openxmlformats.org/officeDocument/2006/customXml" ds:itemID="{F3050DF5-BD41-4CBE-90C1-8D28B9CFA94C}">
+  <ds:schemaRefs>
+    <ds:schemaRef ds:uri="http://schemas.microsoft.com/office/2006/metadata/properties"/>
+    <ds:schemaRef ds:uri="http://schemas.microsoft.com/office/infopath/2007/PartnerControls"/>
+    <ds:schemaRef ds:uri="8a383c2e-bd54-4902-a119-5b87932b8e96"/>
+    <ds:schemaRef ds:uri="bb47c008-c9da-4c4d-aa48-f28061b9cf67"/>
+  </ds:schemaRefs>
+</ds:datastoreItem>
+</file>
+
 <file path=customXml/itemProps3.xml><?xml version="1.0" encoding="utf-8"?>
 <ds:datastoreItem xmlns:ds="http://schemas.openxmlformats.org/officeDocument/2006/customXml" ds:itemID="{E31CCCC5-5A07-4BA8-AF4B-0E8119209082}">
   <ds:schemaRefs>

</xml_diff>